<commit_message>
Remove noise from 7 Oct daily sprint report
Co-Authored-By: Claude Opus 5.5 <noreply@anthropic.com>
Claude-Session: https://claude.ai/code/session_0128GGMJqj1fgFawc5fV1mHg
</commit_message>
<xml_diff>
--- a/reports/Daily_Sprint_Report_2026-10-07.docx
+++ b/reports/Daily_Sprint_Report_2026-10-07.docx
@@ -8,7 +8,7 @@
           <w:b/>
           <w:sz w:val="32"/>
         </w:rPr>
-        <w:t>Daily Project Status Report – Current Sprint &amp; Retrospective</w:t>
+        <w:t>Daily Sprint Status Report</w:t>
       </w:r>
     </w:p>
     <w:p>
@@ -16,16 +16,7 @@
         <w:rPr>
           <w:i/>
         </w:rPr>
-        <w:t>Reporting date: 07 Oct 2026 (today only)  |  Source: Jira (uvation-devops)</w:t>
-      </w:r>
-    </w:p>
-    <w:p>
-      <w:r>
-        <w:rPr>
-          <w:i/>
-          <w:sz w:val="18"/>
-        </w:rPr>
-        <w:t>Scope: only tickets in the current sprint and the Retrospective sprint (plus their subtasks); no other project tickets. Current sprints – Marketplace, Marketing, Identity: October 1st Sprint (01–14 Oct); USP: Sept 2nd Sprint (15–29 Sep, still open). Utilisation shows open sprint tickets per person and today's Jira activity; Jira does not hold time-based utilisation %.</w:t>
+        <w:t>Date: 07 Oct 2026  |  Current sprint &amp; Retrospective</w:t>
       </w:r>
     </w:p>
     <w:p>
@@ -709,40 +700,10 @@
         <w:rPr>
           <w:b/>
         </w:rPr>
-        <w:t>Next Demo:</w:t>
-      </w:r>
-      <w:r>
-        <w:t xml:space="preserve"> TBC</w:t>
-      </w:r>
-    </w:p>
-    <w:p>
-      <w:pPr>
-        <w:pStyle w:val="ListBullet"/>
-        <w:spacing w:after="0"/>
-      </w:pPr>
-      <w:r>
-        <w:rPr>
-          <w:b/>
-        </w:rPr>
         <w:t>Next Release:</w:t>
       </w:r>
       <w:r>
         <w:t xml:space="preserve"> Marketplace v1.3 – 15 Oct 2026</w:t>
-      </w:r>
-    </w:p>
-    <w:p>
-      <w:pPr>
-        <w:pStyle w:val="ListBullet"/>
-        <w:spacing w:after="0"/>
-      </w:pPr>
-      <w:r>
-        <w:rPr>
-          <w:b/>
-        </w:rPr>
-        <w:t>UAT / Production:</w:t>
-      </w:r>
-      <w:r>
-        <w:t xml:space="preserve"> Returns/Refund P2 (MT-1331) closed today – production TBC</w:t>
       </w:r>
     </w:p>
     <w:p>
@@ -1335,38 +1296,38 @@
     </w:p>
     <w:p>
       <w:pPr>
-        <w:pStyle w:val="ListNumber"/>
         <w:spacing w:after="0"/>
+        <w:ind w:left="360"/>
       </w:pPr>
       <w:r>
-        <w:t>Close MT-1573 (overdue) and MT-1545 (due 8 Oct).</w:t>
+        <w:t>1. Close MT-1573 (overdue) and MT-1545 (due 8 Oct).</w:t>
       </w:r>
     </w:p>
     <w:p>
       <w:pPr>
-        <w:pStyle w:val="ListNumber"/>
         <w:spacing w:after="0"/>
+        <w:ind w:left="360"/>
       </w:pPr>
       <w:r>
-        <w:t>Start live chat dev (MT-1579) and finalise platform setup (MT-1578).</w:t>
+        <w:t>2. Start live chat dev (MT-1579) and finalise platform setup (MT-1578).</w:t>
       </w:r>
     </w:p>
     <w:p>
       <w:pPr>
-        <w:pStyle w:val="ListNumber"/>
         <w:spacing w:after="0"/>
+        <w:ind w:left="360"/>
       </w:pPr>
       <w:r>
-        <w:t>Progress RMA item-level decisions (MT-1566, MT-1568, MT-1570).</w:t>
+        <w:t>3. Progress RMA item-level decisions (MT-1566, MT-1568, MT-1570).</w:t>
       </w:r>
     </w:p>
     <w:p>
       <w:pPr>
-        <w:pStyle w:val="ListNumber"/>
         <w:spacing w:after="0"/>
+        <w:ind w:left="360"/>
       </w:pPr>
       <w:r>
-        <w:t>Start To Do sprint items (MT-1553, MT-1541, MT-1559).</w:t>
+        <w:t>4. Start To Do sprint items (MT-1553, MT-1541, MT-1559).</w:t>
       </w:r>
     </w:p>
     <w:p>
@@ -2055,36 +2016,6 @@
         <w:rPr>
           <w:b/>
         </w:rPr>
-        <w:t>Next Demo:</w:t>
-      </w:r>
-      <w:r>
-        <w:t xml:space="preserve"> TBC</w:t>
-      </w:r>
-    </w:p>
-    <w:p>
-      <w:pPr>
-        <w:pStyle w:val="ListBullet"/>
-        <w:spacing w:after="0"/>
-      </w:pPr>
-      <w:r>
-        <w:rPr>
-          <w:b/>
-        </w:rPr>
-        <w:t>Next Release:</w:t>
-      </w:r>
-      <w:r>
-        <w:t xml:space="preserve"> Retrospective Ready-for-Prod batch (14 tickets) – TBC</w:t>
-      </w:r>
-    </w:p>
-    <w:p>
-      <w:pPr>
-        <w:pStyle w:val="ListBullet"/>
-        <w:spacing w:after="0"/>
-      </w:pPr>
-      <w:r>
-        <w:rPr>
-          <w:b/>
-        </w:rPr>
         <w:t>UAT / Production:</w:t>
       </w:r>
       <w:r>
@@ -2528,38 +2459,38 @@
     </w:p>
     <w:p>
       <w:pPr>
-        <w:pStyle w:val="ListNumber"/>
         <w:spacing w:after="0"/>
+        <w:ind w:left="360"/>
       </w:pPr>
       <w:r>
-        <w:t>Close tickets due today (MR-1288, MR-1314, MR-1315).</w:t>
+        <w:t>1. Close tickets due today (MR-1288, MR-1314, MR-1315).</w:t>
       </w:r>
     </w:p>
     <w:p>
       <w:pPr>
-        <w:pStyle w:val="ListNumber"/>
         <w:spacing w:after="0"/>
+        <w:ind w:left="360"/>
       </w:pPr>
       <w:r>
-        <w:t>Fix cross-browser issues (MR-1318 to MR-1323), starting with the 404 redirect (MR-1319).</w:t>
+        <w:t>2. Fix cross-browser issues (MR-1318 to MR-1323), starting with the 404 redirect (MR-1319).</w:t>
       </w:r>
     </w:p>
     <w:p>
       <w:pPr>
-        <w:pStyle w:val="ListNumber"/>
         <w:spacing w:after="0"/>
+        <w:ind w:left="360"/>
       </w:pPr>
       <w:r>
-        <w:t>Complete Dev Testing of MR-1296, MR-1301, MR-1302, MR-1305.</w:t>
+        <w:t>3. Complete Dev Testing of MR-1296, MR-1301, MR-1302, MR-1305.</w:t>
       </w:r>
     </w:p>
     <w:p>
       <w:pPr>
-        <w:pStyle w:val="ListNumber"/>
         <w:spacing w:after="0"/>
+        <w:ind w:left="360"/>
       </w:pPr>
       <w:r>
-        <w:t>Continue security (MR-1289) and smoke regression (MR-1282) testing.</w:t>
+        <w:t>4. Continue security (MR-1289) and smoke regression (MR-1282) testing.</w:t>
       </w:r>
     </w:p>
     <w:p>
@@ -2946,248 +2877,7 @@
           <w:b/>
           <w:sz w:val="22"/>
         </w:rPr>
-        <w:t>Dependencies</w:t>
-      </w:r>
-    </w:p>
-    <w:tbl>
-      <w:tblPr>
-        <w:tblStyle w:val="TableGrid"/>
-        <w:tblW w:type="auto" w:w="0"/>
-        <w:tblLook w:firstColumn="1" w:firstRow="1" w:lastColumn="0" w:lastRow="0" w:noHBand="0" w:noVBand="1" w:val="04A0"/>
-      </w:tblPr>
-      <w:tblGrid>
-        <w:gridCol w:w="1728"/>
-        <w:gridCol w:w="1728"/>
-        <w:gridCol w:w="1728"/>
-        <w:gridCol w:w="1728"/>
-        <w:gridCol w:w="1728"/>
-      </w:tblGrid>
-      <w:tr>
-        <w:tc>
-          <w:tcPr>
-            <w:tcW w:type="dxa" w:w="1728"/>
-            <w:shd w:val="clear" w:color="auto" w:fill="D9D9D9"/>
-          </w:tcPr>
-          <w:p>
-            <w:r>
-              <w:rPr>
-                <w:sz w:val="18"/>
-              </w:rPr>
-            </w:r>
-            <w:r>
-              <w:rPr>
-                <w:b/>
-                <w:sz w:val="18"/>
-              </w:rPr>
-              <w:t>Dependency</w:t>
-            </w:r>
-          </w:p>
-        </w:tc>
-        <w:tc>
-          <w:tcPr>
-            <w:tcW w:type="dxa" w:w="1728"/>
-            <w:shd w:val="clear" w:color="auto" w:fill="D9D9D9"/>
-          </w:tcPr>
-          <w:p>
-            <w:r>
-              <w:rPr>
-                <w:sz w:val="18"/>
-              </w:rPr>
-            </w:r>
-            <w:r>
-              <w:rPr>
-                <w:b/>
-                <w:sz w:val="18"/>
-              </w:rPr>
-              <w:t>Status</w:t>
-            </w:r>
-          </w:p>
-        </w:tc>
-        <w:tc>
-          <w:tcPr>
-            <w:tcW w:type="dxa" w:w="1728"/>
-            <w:shd w:val="clear" w:color="auto" w:fill="D9D9D9"/>
-          </w:tcPr>
-          <w:p>
-            <w:r>
-              <w:rPr>
-                <w:sz w:val="18"/>
-              </w:rPr>
-            </w:r>
-            <w:r>
-              <w:rPr>
-                <w:b/>
-                <w:sz w:val="18"/>
-              </w:rPr>
-              <w:t>Impact</w:t>
-            </w:r>
-          </w:p>
-        </w:tc>
-        <w:tc>
-          <w:tcPr>
-            <w:tcW w:type="dxa" w:w="1728"/>
-            <w:shd w:val="clear" w:color="auto" w:fill="D9D9D9"/>
-          </w:tcPr>
-          <w:p>
-            <w:r>
-              <w:rPr>
-                <w:sz w:val="18"/>
-              </w:rPr>
-            </w:r>
-            <w:r>
-              <w:rPr>
-                <w:b/>
-                <w:sz w:val="18"/>
-              </w:rPr>
-              <w:t>Owner</w:t>
-            </w:r>
-          </w:p>
-        </w:tc>
-        <w:tc>
-          <w:tcPr>
-            <w:tcW w:type="dxa" w:w="1728"/>
-            <w:shd w:val="clear" w:color="auto" w:fill="D9D9D9"/>
-          </w:tcPr>
-          <w:p>
-            <w:r>
-              <w:rPr>
-                <w:sz w:val="18"/>
-              </w:rPr>
-            </w:r>
-            <w:r>
-              <w:rPr>
-                <w:b/>
-                <w:sz w:val="18"/>
-              </w:rPr>
-              <w:t>Expected Date</w:t>
-            </w:r>
-          </w:p>
-        </w:tc>
-      </w:tr>
-      <w:tr>
-        <w:tc>
-          <w:tcPr>
-            <w:tcW w:type="dxa" w:w="1728"/>
-          </w:tcPr>
-          <w:p>
-            <w:r>
-              <w:rPr>
-                <w:sz w:val="18"/>
-              </w:rPr>
-              <w:t>Next sprint planning</w:t>
-            </w:r>
-          </w:p>
-        </w:tc>
-        <w:tc>
-          <w:tcPr>
-            <w:tcW w:type="dxa" w:w="1728"/>
-          </w:tcPr>
-          <w:p>
-            <w:r>
-              <w:rPr>
-                <w:sz w:val="18"/>
-              </w:rPr>
-              <w:t>Pending</w:t>
-            </w:r>
-          </w:p>
-        </w:tc>
-        <w:tc>
-          <w:tcPr>
-            <w:tcW w:type="dxa" w:w="1728"/>
-          </w:tcPr>
-          <w:p>
-            <w:r>
-              <w:rPr>
-                <w:sz w:val="18"/>
-              </w:rPr>
-              <w:t>Sprint tracking for USP</w:t>
-            </w:r>
-          </w:p>
-        </w:tc>
-        <w:tc>
-          <w:tcPr>
-            <w:tcW w:type="dxa" w:w="1728"/>
-          </w:tcPr>
-          <w:p>
-            <w:r>
-              <w:rPr>
-                <w:sz w:val="18"/>
-              </w:rPr>
-              <w:t>USP team</w:t>
-            </w:r>
-          </w:p>
-        </w:tc>
-        <w:tc>
-          <w:tcPr>
-            <w:tcW w:type="dxa" w:w="1728"/>
-          </w:tcPr>
-          <w:p>
-            <w:r>
-              <w:rPr>
-                <w:sz w:val="18"/>
-              </w:rPr>
-              <w:t>TBC</w:t>
-            </w:r>
-          </w:p>
-        </w:tc>
-      </w:tr>
-    </w:tbl>
-    <w:p/>
-    <w:p>
-      <w:pPr>
-        <w:spacing w:before="200" w:after="80"/>
-      </w:pPr>
-      <w:r>
-        <w:rPr>
-          <w:b/>
-          <w:sz w:val="22"/>
-        </w:rPr>
         <w:t>Upcoming Milestones</w:t>
-      </w:r>
-    </w:p>
-    <w:p>
-      <w:pPr>
-        <w:pStyle w:val="ListBullet"/>
-        <w:spacing w:after="0"/>
-      </w:pPr>
-      <w:r>
-        <w:rPr>
-          <w:b/>
-        </w:rPr>
-        <w:t>Next Demo:</w:t>
-      </w:r>
-      <w:r>
-        <w:t xml:space="preserve"> TBC</w:t>
-      </w:r>
-    </w:p>
-    <w:p>
-      <w:pPr>
-        <w:pStyle w:val="ListBullet"/>
-        <w:spacing w:after="0"/>
-      </w:pPr>
-      <w:r>
-        <w:rPr>
-          <w:b/>
-        </w:rPr>
-        <w:t>Next Release:</w:t>
-      </w:r>
-      <w:r>
-        <w:t xml:space="preserve"> TBC</w:t>
-      </w:r>
-    </w:p>
-    <w:p>
-      <w:pPr>
-        <w:pStyle w:val="ListBullet"/>
-        <w:spacing w:after="0"/>
-      </w:pPr>
-      <w:r>
-        <w:rPr>
-          <w:b/>
-        </w:rPr>
-        <w:t>UAT / Production:</w:t>
-      </w:r>
-      <w:r>
-        <w:t xml:space="preserve"> 13 tickets already Deployed in Prod – closure TBC</w:t>
       </w:r>
     </w:p>
     <w:p>
@@ -3473,168 +3163,6 @@
           </w:p>
         </w:tc>
       </w:tr>
-      <w:tr>
-        <w:tc>
-          <w:tcPr>
-            <w:tcW w:type="dxa" w:w="2160"/>
-          </w:tcPr>
-          <w:p>
-            <w:r>
-              <w:rPr>
-                <w:sz w:val="18"/>
-              </w:rPr>
-              <w:t>r.jaiswal</w:t>
-            </w:r>
-          </w:p>
-        </w:tc>
-        <w:tc>
-          <w:tcPr>
-            <w:tcW w:type="dxa" w:w="2160"/>
-          </w:tcPr>
-          <w:p>
-            <w:r>
-              <w:rPr>
-                <w:sz w:val="18"/>
-              </w:rPr>
-              <w:t>36 Done in sprint</w:t>
-            </w:r>
-          </w:p>
-        </w:tc>
-        <w:tc>
-          <w:tcPr>
-            <w:tcW w:type="dxa" w:w="2160"/>
-          </w:tcPr>
-          <w:p>
-            <w:r>
-              <w:rPr>
-                <w:sz w:val="18"/>
-              </w:rPr>
-              <w:t>On track</w:t>
-            </w:r>
-          </w:p>
-        </w:tc>
-        <w:tc>
-          <w:tcPr>
-            <w:tcW w:type="dxa" w:w="2160"/>
-          </w:tcPr>
-          <w:p>
-            <w:r>
-              <w:rPr>
-                <w:sz w:val="18"/>
-              </w:rPr>
-              <w:t>—</w:t>
-            </w:r>
-          </w:p>
-        </w:tc>
-      </w:tr>
-      <w:tr>
-        <w:tc>
-          <w:tcPr>
-            <w:tcW w:type="dxa" w:w="2160"/>
-          </w:tcPr>
-          <w:p>
-            <w:r>
-              <w:rPr>
-                <w:sz w:val="18"/>
-              </w:rPr>
-              <w:t>Akhil Katiyar</w:t>
-            </w:r>
-          </w:p>
-        </w:tc>
-        <w:tc>
-          <w:tcPr>
-            <w:tcW w:type="dxa" w:w="2160"/>
-          </w:tcPr>
-          <w:p>
-            <w:r>
-              <w:rPr>
-                <w:sz w:val="18"/>
-              </w:rPr>
-              <w:t>14 Done in sprint</w:t>
-            </w:r>
-          </w:p>
-        </w:tc>
-        <w:tc>
-          <w:tcPr>
-            <w:tcW w:type="dxa" w:w="2160"/>
-          </w:tcPr>
-          <w:p>
-            <w:r>
-              <w:rPr>
-                <w:sz w:val="18"/>
-              </w:rPr>
-              <w:t>On track</w:t>
-            </w:r>
-          </w:p>
-        </w:tc>
-        <w:tc>
-          <w:tcPr>
-            <w:tcW w:type="dxa" w:w="2160"/>
-          </w:tcPr>
-          <w:p>
-            <w:r>
-              <w:rPr>
-                <w:sz w:val="18"/>
-              </w:rPr>
-              <w:t>—</w:t>
-            </w:r>
-          </w:p>
-        </w:tc>
-      </w:tr>
-      <w:tr>
-        <w:tc>
-          <w:tcPr>
-            <w:tcW w:type="dxa" w:w="2160"/>
-          </w:tcPr>
-          <w:p>
-            <w:r>
-              <w:rPr>
-                <w:sz w:val="18"/>
-              </w:rPr>
-              <w:t>Aman prakash</w:t>
-            </w:r>
-          </w:p>
-        </w:tc>
-        <w:tc>
-          <w:tcPr>
-            <w:tcW w:type="dxa" w:w="2160"/>
-          </w:tcPr>
-          <w:p>
-            <w:r>
-              <w:rPr>
-                <w:sz w:val="18"/>
-              </w:rPr>
-              <w:t>11 Done in sprint</w:t>
-            </w:r>
-          </w:p>
-        </w:tc>
-        <w:tc>
-          <w:tcPr>
-            <w:tcW w:type="dxa" w:w="2160"/>
-          </w:tcPr>
-          <w:p>
-            <w:r>
-              <w:rPr>
-                <w:sz w:val="18"/>
-              </w:rPr>
-              <w:t>On track</w:t>
-            </w:r>
-          </w:p>
-        </w:tc>
-        <w:tc>
-          <w:tcPr>
-            <w:tcW w:type="dxa" w:w="2160"/>
-          </w:tcPr>
-          <w:p>
-            <w:r>
-              <w:rPr>
-                <w:sz w:val="18"/>
-              </w:rPr>
-              <w:t>—</w:t>
-            </w:r>
-          </w:p>
-        </w:tc>
-      </w:tr>
     </w:tbl>
     <w:p/>
     <w:p>
@@ -3672,29 +3200,29 @@
     </w:p>
     <w:p>
       <w:pPr>
-        <w:pStyle w:val="ListNumber"/>
         <w:spacing w:after="0"/>
+        <w:ind w:left="360"/>
       </w:pPr>
       <w:r>
-        <w:t>Close the 13 Deployed-in-Prod tickets.</w:t>
+        <w:t>1. Close the 13 Deployed-in-Prod tickets.</w:t>
       </w:r>
     </w:p>
     <w:p>
       <w:pPr>
-        <w:pStyle w:val="ListNumber"/>
         <w:spacing w:after="0"/>
+        <w:ind w:left="360"/>
       </w:pPr>
       <w:r>
-        <w:t>Close Sept 2nd Sprint; move USP-4252 to the next sprint.</w:t>
+        <w:t>2. Close Sept 2nd Sprint; move USP-4252 to the next sprint.</w:t>
       </w:r>
     </w:p>
     <w:p>
       <w:pPr>
-        <w:pStyle w:val="ListNumber"/>
         <w:spacing w:after="0"/>
+        <w:ind w:left="360"/>
       </w:pPr>
       <w:r>
-        <w:t>Plan and start the next sprint.</w:t>
+        <w:t>3. Plan and start the next sprint.</w:t>
       </w:r>
     </w:p>
     <w:p>
@@ -4249,36 +3777,6 @@
         <w:rPr>
           <w:b/>
         </w:rPr>
-        <w:t>Next Demo:</w:t>
-      </w:r>
-      <w:r>
-        <w:t xml:space="preserve"> TBC</w:t>
-      </w:r>
-    </w:p>
-    <w:p>
-      <w:pPr>
-        <w:pStyle w:val="ListBullet"/>
-        <w:spacing w:after="0"/>
-      </w:pPr>
-      <w:r>
-        <w:rPr>
-          <w:b/>
-        </w:rPr>
-        <w:t>Next Release:</w:t>
-      </w:r>
-      <w:r>
-        <w:t xml:space="preserve"> Field-validation UI fixes (closed today) – production TBC</w:t>
-      </w:r>
-    </w:p>
-    <w:p>
-      <w:pPr>
-        <w:pStyle w:val="ListBullet"/>
-        <w:spacing w:after="0"/>
-      </w:pPr>
-      <w:r>
-        <w:rPr>
-          <w:b/>
-        </w:rPr>
         <w:t>UAT / Production:</w:t>
       </w:r>
       <w:r>
@@ -4633,83 +4131,43 @@
           <w:b/>
           <w:sz w:val="22"/>
         </w:rPr>
-        <w:t>Management Attention / Decisions Required</w:t>
-      </w:r>
-    </w:p>
-    <w:p>
-      <w:pPr>
-        <w:pStyle w:val="ListBullet"/>
-        <w:spacing w:after="0"/>
-      </w:pPr>
-      <w:r>
-        <w:t>None today.</w:t>
-      </w:r>
-    </w:p>
-    <w:p>
-      <w:pPr>
-        <w:spacing w:before="200" w:after="80"/>
-      </w:pPr>
-      <w:r>
-        <w:rPr>
-          <w:b/>
-          <w:sz w:val="22"/>
-        </w:rPr>
         <w:t>Next Day Focus</w:t>
       </w:r>
     </w:p>
     <w:p>
       <w:pPr>
-        <w:pStyle w:val="ListNumber"/>
         <w:spacing w:after="0"/>
+        <w:ind w:left="360"/>
       </w:pPr>
       <w:r>
-        <w:t>Start and complete Rafay account provisioning (ID-746).</w:t>
+        <w:t>1. Start and complete Rafay account provisioning (ID-746).</w:t>
       </w:r>
     </w:p>
     <w:p>
       <w:pPr>
-        <w:pStyle w:val="ListNumber"/>
         <w:spacing w:after="0"/>
+        <w:ind w:left="360"/>
       </w:pPr>
       <w:r>
-        <w:t>Progress GDPR deletion subtasks (ID-749, ID-750).</w:t>
+        <w:t>2. Progress GDPR deletion subtasks (ID-749, ID-750).</w:t>
       </w:r>
     </w:p>
     <w:p>
       <w:pPr>
-        <w:pStyle w:val="ListNumber"/>
         <w:spacing w:after="0"/>
+        <w:ind w:left="360"/>
       </w:pPr>
       <w:r>
-        <w:t>Complete Dev Testing of ID-713 and ID-733.</w:t>
+        <w:t>3. Complete Dev Testing of ID-713 and ID-733.</w:t>
       </w:r>
     </w:p>
     <w:p>
       <w:pPr>
-        <w:pStyle w:val="ListNumber"/>
         <w:spacing w:after="0"/>
+        <w:ind w:left="360"/>
       </w:pPr>
       <w:r>
-        <w:t>Start security / privacy / regression stories (ID-715, ID-721, ID-727).</w:t>
-      </w:r>
-    </w:p>
-    <w:p>
-      <w:r>
-        <w:rPr>
-          <w:b/>
-          <w:color w:val="1F3A5F"/>
-          <w:sz w:val="28"/>
-        </w:rPr>
-        <w:t>5. Uvation Atlas (ATLAS) and 6. Uvation Pulse (PULSE)</w:t>
-      </w:r>
-    </w:p>
-    <w:p>
-      <w:pPr>
-        <w:pStyle w:val="ListBullet"/>
-        <w:spacing w:after="0"/>
-      </w:pPr>
-      <w:r>
-        <w:t>No active sprint and no Retrospective sprint – no tickets in scope for this report.</w:t>
+        <w:t>4. Start security / privacy / regression stories (ID-715, ID-721, ID-727).</w:t>
       </w:r>
     </w:p>
     <w:sectPr>

</xml_diff>